<commit_message>
#170 Fixed serious build problem with component directory build
Added some early task objects
</commit_message>
<xml_diff>
--- a/specification/fs_converter.docx
+++ b/specification/fs_converter.docx
@@ -274,7 +274,7 @@
                     <w:b w:val="0"/>
                     <w:noProof/>
                   </w:rPr>
-                  <w:t>February 23</w:t>
+                  <w:t>March 2</w:t>
                 </w:r>
                 <w:r>
                   <w:rPr>
@@ -593,7 +593,7 @@
           <w:r>
             <w:fldChar w:fldCharType="separate"/>
           </w:r>
-          <w:hyperlink w:anchor="_Toc222602465" w:history="1">
+          <w:hyperlink w:anchor="_Toc222825903" w:history="1">
             <w:r>
               <w:rPr>
                 <w:rStyle w:val="Hyperlnk"/>
@@ -620,7 +620,7 @@
                 <w:noProof/>
                 <w:webHidden/>
               </w:rPr>
-              <w:instrText xml:space="preserve"> PAGEREF _Toc222602465 \h </w:instrText>
+              <w:instrText xml:space="preserve"> PAGEREF _Toc222825903 \h </w:instrText>
             </w:r>
             <w:r>
               <w:rPr>
@@ -667,7 +667,7 @@
               <w14:ligatures w14:val="standardContextual"/>
             </w:rPr>
           </w:pPr>
-          <w:hyperlink w:anchor="_Toc222602466" w:history="1">
+          <w:hyperlink w:anchor="_Toc222825904" w:history="1">
             <w:r>
               <w:rPr>
                 <w:rStyle w:val="Hyperlnk"/>
@@ -694,7 +694,7 @@
                 <w:noProof/>
                 <w:webHidden/>
               </w:rPr>
-              <w:instrText xml:space="preserve"> PAGEREF _Toc222602466 \h </w:instrText>
+              <w:instrText xml:space="preserve"> PAGEREF _Toc222825904 \h </w:instrText>
             </w:r>
             <w:r>
               <w:rPr>
@@ -741,13 +741,13 @@
               <w14:ligatures w14:val="standardContextual"/>
             </w:rPr>
           </w:pPr>
-          <w:hyperlink w:anchor="_Toc222602467" w:history="1">
+          <w:hyperlink w:anchor="_Toc222825905" w:history="1">
             <w:r>
               <w:rPr>
                 <w:rStyle w:val="Hyperlnk"/>
                 <w:noProof/>
               </w:rPr>
-              <w:t>Converter Task</w:t>
+              <w:t>MDF Task</w:t>
             </w:r>
             <w:r>
               <w:rPr>
@@ -768,7 +768,7 @@
                 <w:noProof/>
                 <w:webHidden/>
               </w:rPr>
-              <w:instrText xml:space="preserve"> PAGEREF _Toc222602467 \h </w:instrText>
+              <w:instrText xml:space="preserve"> PAGEREF _Toc222825905 \h </w:instrText>
             </w:r>
             <w:r>
               <w:rPr>
@@ -815,7 +815,7 @@
               <w14:ligatures w14:val="standardContextual"/>
             </w:rPr>
           </w:pPr>
-          <w:hyperlink w:anchor="_Toc222602468" w:history="1">
+          <w:hyperlink w:anchor="_Toc222825906" w:history="1">
             <w:r>
               <w:rPr>
                 <w:rStyle w:val="Hyperlnk"/>
@@ -842,7 +842,7 @@
                 <w:noProof/>
                 <w:webHidden/>
               </w:rPr>
-              <w:instrText xml:space="preserve"> PAGEREF _Toc222602468 \h </w:instrText>
+              <w:instrText xml:space="preserve"> PAGEREF _Toc222825906 \h </w:instrText>
             </w:r>
             <w:r>
               <w:rPr>
@@ -889,7 +889,7 @@
               <w14:ligatures w14:val="standardContextual"/>
             </w:rPr>
           </w:pPr>
-          <w:hyperlink w:anchor="_Toc222602469" w:history="1">
+          <w:hyperlink w:anchor="_Toc222825907" w:history="1">
             <w:r>
               <w:rPr>
                 <w:rStyle w:val="Hyperlnk"/>
@@ -916,7 +916,7 @@
                 <w:noProof/>
                 <w:webHidden/>
               </w:rPr>
-              <w:instrText xml:space="preserve"> PAGEREF _Toc222602469 \h </w:instrText>
+              <w:instrText xml:space="preserve"> PAGEREF _Toc222825907 \h </w:instrText>
             </w:r>
             <w:r>
               <w:rPr>
@@ -963,7 +963,7 @@
               <w14:ligatures w14:val="standardContextual"/>
             </w:rPr>
           </w:pPr>
-          <w:hyperlink w:anchor="_Toc222602470" w:history="1">
+          <w:hyperlink w:anchor="_Toc222825908" w:history="1">
             <w:r>
               <w:rPr>
                 <w:rStyle w:val="Hyperlnk"/>
@@ -990,7 +990,7 @@
                 <w:noProof/>
                 <w:webHidden/>
               </w:rPr>
-              <w:instrText xml:space="preserve"> PAGEREF _Toc222602470 \h </w:instrText>
+              <w:instrText xml:space="preserve"> PAGEREF _Toc222825908 \h </w:instrText>
             </w:r>
             <w:r>
               <w:rPr>
@@ -1037,7 +1037,7 @@
               <w14:ligatures w14:val="standardContextual"/>
             </w:rPr>
           </w:pPr>
-          <w:hyperlink w:anchor="_Toc222602471" w:history="1">
+          <w:hyperlink w:anchor="_Toc222825909" w:history="1">
             <w:r>
               <w:rPr>
                 <w:rStyle w:val="Hyperlnk"/>
@@ -1064,7 +1064,7 @@
                 <w:noProof/>
                 <w:webHidden/>
               </w:rPr>
-              <w:instrText xml:space="preserve"> PAGEREF _Toc222602471 \h </w:instrText>
+              <w:instrText xml:space="preserve"> PAGEREF _Toc222825909 \h </w:instrText>
             </w:r>
             <w:r>
               <w:rPr>
@@ -1111,7 +1111,7 @@
               <w14:ligatures w14:val="standardContextual"/>
             </w:rPr>
           </w:pPr>
-          <w:hyperlink w:anchor="_Toc222602472" w:history="1">
+          <w:hyperlink w:anchor="_Toc222825910" w:history="1">
             <w:r>
               <w:rPr>
                 <w:rStyle w:val="Hyperlnk"/>
@@ -1138,7 +1138,7 @@
                 <w:noProof/>
                 <w:webHidden/>
               </w:rPr>
-              <w:instrText xml:space="preserve"> PAGEREF _Toc222602472 \h </w:instrText>
+              <w:instrText xml:space="preserve"> PAGEREF _Toc222825910 \h </w:instrText>
             </w:r>
             <w:r>
               <w:rPr>
@@ -1185,7 +1185,7 @@
               <w14:ligatures w14:val="standardContextual"/>
             </w:rPr>
           </w:pPr>
-          <w:hyperlink w:anchor="_Toc222602473" w:history="1">
+          <w:hyperlink w:anchor="_Toc222825911" w:history="1">
             <w:r>
               <w:rPr>
                 <w:rStyle w:val="Hyperlnk"/>
@@ -1212,7 +1212,7 @@
                 <w:noProof/>
                 <w:webHidden/>
               </w:rPr>
-              <w:instrText xml:space="preserve"> PAGEREF _Toc222602473 \h </w:instrText>
+              <w:instrText xml:space="preserve"> PAGEREF _Toc222825911 \h </w:instrText>
             </w:r>
             <w:r>
               <w:rPr>
@@ -1259,7 +1259,7 @@
               <w14:ligatures w14:val="standardContextual"/>
             </w:rPr>
           </w:pPr>
-          <w:hyperlink w:anchor="_Toc222602474" w:history="1">
+          <w:hyperlink w:anchor="_Toc222825912" w:history="1">
             <w:r>
               <w:rPr>
                 <w:rStyle w:val="Hyperlnk"/>
@@ -1286,7 +1286,7 @@
                 <w:noProof/>
                 <w:webHidden/>
               </w:rPr>
-              <w:instrText xml:space="preserve"> PAGEREF _Toc222602474 \h </w:instrText>
+              <w:instrText xml:space="preserve"> PAGEREF _Toc222825912 \h </w:instrText>
             </w:r>
             <w:r>
               <w:rPr>
@@ -1333,7 +1333,7 @@
               <w14:ligatures w14:val="standardContextual"/>
             </w:rPr>
           </w:pPr>
-          <w:hyperlink w:anchor="_Toc222602475" w:history="1">
+          <w:hyperlink w:anchor="_Toc222825913" w:history="1">
             <w:r>
               <w:rPr>
                 <w:rStyle w:val="Hyperlnk"/>
@@ -1360,7 +1360,7 @@
                 <w:noProof/>
                 <w:webHidden/>
               </w:rPr>
-              <w:instrText xml:space="preserve"> PAGEREF _Toc222602475 \h </w:instrText>
+              <w:instrText xml:space="preserve"> PAGEREF _Toc222825913 \h </w:instrText>
             </w:r>
             <w:r>
               <w:rPr>
@@ -1407,7 +1407,7 @@
               <w14:ligatures w14:val="standardContextual"/>
             </w:rPr>
           </w:pPr>
-          <w:hyperlink w:anchor="_Toc222602476" w:history="1">
+          <w:hyperlink w:anchor="_Toc222825914" w:history="1">
             <w:r>
               <w:rPr>
                 <w:rStyle w:val="Hyperlnk"/>
@@ -1434,7 +1434,7 @@
                 <w:noProof/>
                 <w:webHidden/>
               </w:rPr>
-              <w:instrText xml:space="preserve"> PAGEREF _Toc222602476 \h </w:instrText>
+              <w:instrText xml:space="preserve"> PAGEREF _Toc222825914 \h </w:instrText>
             </w:r>
             <w:r>
               <w:rPr>
@@ -1481,7 +1481,7 @@
               <w14:ligatures w14:val="standardContextual"/>
             </w:rPr>
           </w:pPr>
-          <w:hyperlink w:anchor="_Toc222602477" w:history="1">
+          <w:hyperlink w:anchor="_Toc222825915" w:history="1">
             <w:r>
               <w:rPr>
                 <w:rStyle w:val="Hyperlnk"/>
@@ -1508,7 +1508,7 @@
                 <w:noProof/>
                 <w:webHidden/>
               </w:rPr>
-              <w:instrText xml:space="preserve"> PAGEREF _Toc222602477 \h </w:instrText>
+              <w:instrText xml:space="preserve"> PAGEREF _Toc222825915 \h </w:instrText>
             </w:r>
             <w:r>
               <w:rPr>
@@ -1555,7 +1555,7 @@
               <w14:ligatures w14:val="standardContextual"/>
             </w:rPr>
           </w:pPr>
-          <w:hyperlink w:anchor="_Toc222602478" w:history="1">
+          <w:hyperlink w:anchor="_Toc222825916" w:history="1">
             <w:r>
               <w:rPr>
                 <w:rStyle w:val="Hyperlnk"/>
@@ -1582,7 +1582,7 @@
                 <w:noProof/>
                 <w:webHidden/>
               </w:rPr>
-              <w:instrText xml:space="preserve"> PAGEREF _Toc222602478 \h </w:instrText>
+              <w:instrText xml:space="preserve"> PAGEREF _Toc222825916 \h </w:instrText>
             </w:r>
             <w:r>
               <w:rPr>
@@ -1629,7 +1629,7 @@
               <w14:ligatures w14:val="standardContextual"/>
             </w:rPr>
           </w:pPr>
-          <w:hyperlink w:anchor="_Toc222602479" w:history="1">
+          <w:hyperlink w:anchor="_Toc222825917" w:history="1">
             <w:r>
               <w:rPr>
                 <w:rStyle w:val="Hyperlnk"/>
@@ -1656,7 +1656,7 @@
                 <w:noProof/>
                 <w:webHidden/>
               </w:rPr>
-              <w:instrText xml:space="preserve"> PAGEREF _Toc222602479 \h </w:instrText>
+              <w:instrText xml:space="preserve"> PAGEREF _Toc222825917 \h </w:instrText>
             </w:r>
             <w:r>
               <w:rPr>
@@ -1703,7 +1703,7 @@
               <w14:ligatures w14:val="standardContextual"/>
             </w:rPr>
           </w:pPr>
-          <w:hyperlink w:anchor="_Toc222602480" w:history="1">
+          <w:hyperlink w:anchor="_Toc222825918" w:history="1">
             <w:r>
               <w:rPr>
                 <w:rStyle w:val="Hyperlnk"/>
@@ -1730,7 +1730,7 @@
                 <w:noProof/>
                 <w:webHidden/>
               </w:rPr>
-              <w:instrText xml:space="preserve"> PAGEREF _Toc222602480 \h </w:instrText>
+              <w:instrText xml:space="preserve"> PAGEREF _Toc222825918 \h </w:instrText>
             </w:r>
             <w:r>
               <w:rPr>
@@ -1777,7 +1777,7 @@
               <w14:ligatures w14:val="standardContextual"/>
             </w:rPr>
           </w:pPr>
-          <w:hyperlink w:anchor="_Toc222602481" w:history="1">
+          <w:hyperlink w:anchor="_Toc222825919" w:history="1">
             <w:r>
               <w:rPr>
                 <w:rStyle w:val="Hyperlnk"/>
@@ -1804,7 +1804,7 @@
                 <w:noProof/>
                 <w:webHidden/>
               </w:rPr>
-              <w:instrText xml:space="preserve"> PAGEREF _Toc222602481 \h </w:instrText>
+              <w:instrText xml:space="preserve"> PAGEREF _Toc222825919 \h </w:instrText>
             </w:r>
             <w:r>
               <w:rPr>
@@ -1851,7 +1851,7 @@
               <w14:ligatures w14:val="standardContextual"/>
             </w:rPr>
           </w:pPr>
-          <w:hyperlink w:anchor="_Toc222602482" w:history="1">
+          <w:hyperlink w:anchor="_Toc222825920" w:history="1">
             <w:r>
               <w:rPr>
                 <w:rStyle w:val="Hyperlnk"/>
@@ -1878,7 +1878,7 @@
                 <w:noProof/>
                 <w:webHidden/>
               </w:rPr>
-              <w:instrText xml:space="preserve"> PAGEREF _Toc222602482 \h </w:instrText>
+              <w:instrText xml:space="preserve"> PAGEREF _Toc222825920 \h </w:instrText>
             </w:r>
             <w:r>
               <w:rPr>
@@ -1925,7 +1925,7 @@
               <w14:ligatures w14:val="standardContextual"/>
             </w:rPr>
           </w:pPr>
-          <w:hyperlink w:anchor="_Toc222602483" w:history="1">
+          <w:hyperlink w:anchor="_Toc222825921" w:history="1">
             <w:r>
               <w:rPr>
                 <w:rStyle w:val="Hyperlnk"/>
@@ -1952,7 +1952,7 @@
                 <w:noProof/>
                 <w:webHidden/>
               </w:rPr>
-              <w:instrText xml:space="preserve"> PAGEREF _Toc222602483 \h </w:instrText>
+              <w:instrText xml:space="preserve"> PAGEREF _Toc222825921 \h </w:instrText>
             </w:r>
             <w:r>
               <w:rPr>
@@ -2013,7 +2013,7 @@
       <w:pPr>
         <w:pStyle w:val="Rubrik1"/>
       </w:pPr>
-      <w:bookmarkStart w:id="0" w:name="_Toc222602465"/>
+      <w:bookmarkStart w:id="0" w:name="_Toc222825903"/>
       <w:r>
         <w:lastRenderedPageBreak/>
         <w:t>Summary</w:t>
@@ -2248,7 +2248,7 @@
       <w:pPr>
         <w:pStyle w:val="Rubrik1"/>
       </w:pPr>
-      <w:bookmarkStart w:id="1" w:name="_Toc222602466"/>
+      <w:bookmarkStart w:id="1" w:name="_Toc222825904"/>
       <w:r>
         <w:lastRenderedPageBreak/>
         <w:t>Converter</w:t>
@@ -2262,7 +2262,7 @@
       <w:pPr>
         <w:pStyle w:val="Rubrik2"/>
       </w:pPr>
-      <w:bookmarkStart w:id="2" w:name="_Toc222602467"/>
+      <w:bookmarkStart w:id="2" w:name="_Toc222825905"/>
       <w:r>
         <w:t>MDF</w:t>
       </w:r>
@@ -2318,7 +2318,7 @@
       <w:pPr>
         <w:pStyle w:val="Rubrik2"/>
       </w:pPr>
-      <w:bookmarkStart w:id="3" w:name="_Toc222602468"/>
+      <w:bookmarkStart w:id="3" w:name="_Toc222825906"/>
       <w:r>
         <w:t>Bus Master Task</w:t>
       </w:r>
@@ -2401,11 +2401,9 @@
       <w:r>
         <w:t xml:space="preserve">The environmental object is a singleton that defines either a simple one directional message bus or a TX/RX message bus. Several databases, sources and destinations can be attached to the bus. There </w:t>
       </w:r>
-      <w:proofErr w:type="gramStart"/>
-      <w:r>
-        <w:t>exist</w:t>
-      </w:r>
-      <w:proofErr w:type="gramEnd"/>
+      <w:r>
+        <w:t>exists</w:t>
+      </w:r>
       <w:r>
         <w:t xml:space="preserve"> a simple GUI for debugging and simulating different combinations.</w:t>
       </w:r>
@@ -2444,7 +2442,7 @@
       <w:pPr>
         <w:pStyle w:val="Rubrik2"/>
       </w:pPr>
-      <w:bookmarkStart w:id="4" w:name="_Toc222602469"/>
+      <w:bookmarkStart w:id="4" w:name="_Toc222825907"/>
       <w:r>
         <w:t>MDF Converter Object</w:t>
       </w:r>
@@ -2535,7 +2533,7 @@
       <w:pPr>
         <w:pStyle w:val="Rubrik2"/>
       </w:pPr>
-      <w:bookmarkStart w:id="5" w:name="_Toc222602470"/>
+      <w:bookmarkStart w:id="5" w:name="_Toc222825908"/>
       <w:r>
         <w:t>MDF Version</w:t>
       </w:r>
@@ -2558,7 +2556,7 @@
       <w:pPr>
         <w:pStyle w:val="Rubrik2"/>
       </w:pPr>
-      <w:bookmarkStart w:id="6" w:name="_Toc222602471"/>
+      <w:bookmarkStart w:id="6" w:name="_Toc222825909"/>
       <w:r>
         <w:t>Storage Options</w:t>
       </w:r>
@@ -2581,7 +2579,7 @@
       <w:pPr>
         <w:pStyle w:val="Rubrik2"/>
       </w:pPr>
-      <w:bookmarkStart w:id="7" w:name="_Toc222602472"/>
+      <w:bookmarkStart w:id="7" w:name="_Toc222825910"/>
       <w:r>
         <w:t>Overwrite Option</w:t>
       </w:r>
@@ -2626,7 +2624,7 @@
       <w:pPr>
         <w:pStyle w:val="Rubrik2"/>
       </w:pPr>
-      <w:bookmarkStart w:id="8" w:name="_Toc222602473"/>
+      <w:bookmarkStart w:id="8" w:name="_Toc222825911"/>
       <w:r>
         <w:t>Implementation</w:t>
       </w:r>
@@ -2718,7 +2716,7 @@
       <w:pPr>
         <w:pStyle w:val="Rubrik1"/>
       </w:pPr>
-      <w:bookmarkStart w:id="9" w:name="_Toc222602474"/>
+      <w:bookmarkStart w:id="9" w:name="_Toc222825912"/>
       <w:r>
         <w:lastRenderedPageBreak/>
         <w:t>Validat</w:t>
@@ -2804,7 +2802,7 @@
       <w:pPr>
         <w:pStyle w:val="Rubrik2"/>
       </w:pPr>
-      <w:bookmarkStart w:id="10" w:name="_Toc222602475"/>
+      <w:bookmarkStart w:id="10" w:name="_Toc222825913"/>
       <w:r>
         <w:t>Implementation</w:t>
       </w:r>
@@ -2856,7 +2854,7 @@
       <w:pPr>
         <w:pStyle w:val="Rubrik1"/>
       </w:pPr>
-      <w:bookmarkStart w:id="11" w:name="_Toc222602476"/>
+      <w:bookmarkStart w:id="11" w:name="_Toc222825914"/>
       <w:r>
         <w:lastRenderedPageBreak/>
         <w:t>Sort</w:t>
@@ -2933,7 +2931,7 @@
       <w:pPr>
         <w:pStyle w:val="Rubrik2"/>
       </w:pPr>
-      <w:bookmarkStart w:id="12" w:name="_Toc222602477"/>
+      <w:bookmarkStart w:id="12" w:name="_Toc222825915"/>
       <w:r>
         <w:t>Implementation</w:t>
       </w:r>
@@ -2985,7 +2983,7 @@
       <w:pPr>
         <w:pStyle w:val="Rubrik1"/>
       </w:pPr>
-      <w:bookmarkStart w:id="13" w:name="_Toc222602478"/>
+      <w:bookmarkStart w:id="13" w:name="_Toc222825916"/>
       <w:r>
         <w:lastRenderedPageBreak/>
         <w:t>CAN Sort</w:t>
@@ -3103,7 +3101,7 @@
       <w:pPr>
         <w:pStyle w:val="Rubrik2"/>
       </w:pPr>
-      <w:bookmarkStart w:id="14" w:name="_Toc222602479"/>
+      <w:bookmarkStart w:id="14" w:name="_Toc222825917"/>
       <w:r>
         <w:t>Implementation</w:t>
       </w:r>
@@ -3145,7 +3143,7 @@
       <w:pPr>
         <w:pStyle w:val="Rubrik1"/>
       </w:pPr>
-      <w:bookmarkStart w:id="15" w:name="_Toc222602480"/>
+      <w:bookmarkStart w:id="15" w:name="_Toc222825918"/>
       <w:r>
         <w:lastRenderedPageBreak/>
         <w:t>Cutting Task</w:t>
@@ -3245,7 +3243,7 @@
       <w:pPr>
         <w:pStyle w:val="Rubrik2"/>
       </w:pPr>
-      <w:bookmarkStart w:id="16" w:name="_Toc222602481"/>
+      <w:bookmarkStart w:id="16" w:name="_Toc222825919"/>
       <w:r>
         <w:t>Implementation</w:t>
       </w:r>
@@ -3309,7 +3307,7 @@
       <w:pPr>
         <w:pStyle w:val="Rubrik1"/>
       </w:pPr>
-      <w:bookmarkStart w:id="17" w:name="_Toc222602482"/>
+      <w:bookmarkStart w:id="17" w:name="_Toc222825920"/>
       <w:r>
         <w:lastRenderedPageBreak/>
         <w:t xml:space="preserve">Converting to Other </w:t>
@@ -3436,7 +3434,7 @@
       <w:pPr>
         <w:pStyle w:val="Rubrik2"/>
       </w:pPr>
-      <w:bookmarkStart w:id="18" w:name="_Toc222602483"/>
+      <w:bookmarkStart w:id="18" w:name="_Toc222825921"/>
       <w:r>
         <w:t>Implementation</w:t>
       </w:r>
@@ -5403,13 +5401,17 @@
     <w:rsidRoot w:val="00E06268"/>
     <w:rsid w:val="001B55B1"/>
     <w:rsid w:val="003D3A81"/>
+    <w:rsid w:val="00434341"/>
     <w:rsid w:val="00543EB5"/>
     <w:rsid w:val="006354E4"/>
     <w:rsid w:val="006703A3"/>
+    <w:rsid w:val="006966EB"/>
     <w:rsid w:val="007252E6"/>
+    <w:rsid w:val="00766CDF"/>
     <w:rsid w:val="00923A89"/>
     <w:rsid w:val="00BD57DA"/>
     <w:rsid w:val="00CF1333"/>
+    <w:rsid w:val="00D05253"/>
     <w:rsid w:val="00E06268"/>
     <w:rsid w:val="00FC20ED"/>
   </w:rsids>

</xml_diff>